<commit_message>
CR-014: update Word document with 4-member multi-developer collaborative SCM scenario and final release manifest
</commit_message>
<xml_diff>
--- a/docs/CommitSleuth_SCM_Final_Review.docx
+++ b/docs/CommitSleuth_SCM_Final_Review.docx
@@ -72,13 +72,14 @@
         <w:tblLook w:firstColumn="1" w:firstRow="1" w:lastColumn="0" w:lastRow="0" w:noHBand="0" w:noVBand="1" w:val="04A0"/>
       </w:tblPr>
       <w:tblGrid>
-        <w:gridCol w:w="4680"/>
-        <w:gridCol w:w="4680"/>
+        <w:gridCol w:w="3120"/>
+        <w:gridCol w:w="3120"/>
+        <w:gridCol w:w="3120"/>
       </w:tblGrid>
       <w:tr>
         <w:tc>
           <w:tcPr>
-            <w:tcW w:type="dxa" w:w="4608"/>
+            <w:tcW w:type="dxa" w:w="2880"/>
             <w:shd w:fill="1E293B"/>
             <w:tcMar>
               <w:top w:w="120" w:type="dxa"/>
@@ -98,13 +99,13 @@
                 <w:color w:val="FFFFFF"/>
                 <w:sz w:val="19"/>
               </w:rPr>
-              <w:t>Project Team Member</w:t>
+              <w:t>Team Member</w:t>
             </w:r>
           </w:p>
         </w:tc>
         <w:tc>
           <w:tcPr>
-            <w:tcW w:type="dxa" w:w="4608"/>
+            <w:tcW w:type="dxa" w:w="2592"/>
             <w:shd w:fill="1E293B"/>
             <w:tcMar>
               <w:top w:w="120" w:type="dxa"/>
@@ -124,7 +125,33 @@
                 <w:color w:val="FFFFFF"/>
                 <w:sz w:val="19"/>
               </w:rPr>
-              <w:t>Registration Number &amp; Email</w:t>
+              <w:t>Registration No.</w:t>
+            </w:r>
+          </w:p>
+        </w:tc>
+        <w:tc>
+          <w:tcPr>
+            <w:tcW w:type="dxa" w:w="3744"/>
+            <w:shd w:fill="1E293B"/>
+            <w:tcMar>
+              <w:top w:w="120" w:type="dxa"/>
+              <w:bottom w:w="120" w:type="dxa"/>
+              <w:left w:w="140" w:type="dxa"/>
+              <w:right w:w="140" w:type="dxa"/>
+            </w:tcMar>
+          </w:tcPr>
+          <w:p>
+            <w:pPr>
+              <w:jc w:val="left"/>
+            </w:pPr>
+            <w:r>
+              <w:rPr>
+                <w:rFonts w:ascii="Segoe UI" w:hAnsi="Segoe UI"/>
+                <w:b/>
+                <w:color w:val="FFFFFF"/>
+                <w:sz w:val="19"/>
+              </w:rPr>
+              <w:t>Role in SCM Project</w:t>
             </w:r>
           </w:p>
         </w:tc>
@@ -132,13 +159,19 @@
       <w:tr>
         <w:tc>
           <w:tcPr>
-            <w:tcW w:type="dxa" w:w="4608"/>
+            <w:tcW w:type="dxa" w:w="2880"/>
           </w:tcPr>
           <w:p/>
         </w:tc>
         <w:tc>
           <w:tcPr>
-            <w:tcW w:type="dxa" w:w="4608"/>
+            <w:tcW w:type="dxa" w:w="2592"/>
+          </w:tcPr>
+          <w:p/>
+        </w:tc>
+        <w:tc>
+          <w:tcPr>
+            <w:tcW w:type="dxa" w:w="3744"/>
           </w:tcPr>
           <w:p/>
         </w:tc>
@@ -146,13 +179,19 @@
       <w:tr>
         <w:tc>
           <w:tcPr>
-            <w:tcW w:type="dxa" w:w="4608"/>
+            <w:tcW w:type="dxa" w:w="2880"/>
           </w:tcPr>
           <w:p/>
         </w:tc>
         <w:tc>
           <w:tcPr>
-            <w:tcW w:type="dxa" w:w="4608"/>
+            <w:tcW w:type="dxa" w:w="2592"/>
+          </w:tcPr>
+          <w:p/>
+        </w:tc>
+        <w:tc>
+          <w:tcPr>
+            <w:tcW w:type="dxa" w:w="3744"/>
           </w:tcPr>
           <w:p/>
         </w:tc>
@@ -160,7 +199,47 @@
       <w:tr>
         <w:tc>
           <w:tcPr>
-            <w:tcW w:type="dxa" w:w="4608"/>
+            <w:tcW w:type="dxa" w:w="2880"/>
+          </w:tcPr>
+          <w:p/>
+        </w:tc>
+        <w:tc>
+          <w:tcPr>
+            <w:tcW w:type="dxa" w:w="2592"/>
+          </w:tcPr>
+          <w:p/>
+        </w:tc>
+        <w:tc>
+          <w:tcPr>
+            <w:tcW w:type="dxa" w:w="3744"/>
+          </w:tcPr>
+          <w:p/>
+        </w:tc>
+      </w:tr>
+      <w:tr>
+        <w:tc>
+          <w:tcPr>
+            <w:tcW w:type="dxa" w:w="2880"/>
+          </w:tcPr>
+          <w:p/>
+        </w:tc>
+        <w:tc>
+          <w:tcPr>
+            <w:tcW w:type="dxa" w:w="2592"/>
+          </w:tcPr>
+          <w:p/>
+        </w:tc>
+        <w:tc>
+          <w:tcPr>
+            <w:tcW w:type="dxa" w:w="3744"/>
+          </w:tcPr>
+          <w:p/>
+        </w:tc>
+      </w:tr>
+      <w:tr>
+        <w:tc>
+          <w:tcPr>
+            <w:tcW w:type="dxa" w:w="2880"/>
             <w:shd w:fill="FFFFFF"/>
             <w:tcMar>
               <w:top w:w="90" w:type="dxa"/>
@@ -185,7 +264,7 @@
         </w:tc>
         <w:tc>
           <w:tcPr>
-            <w:tcW w:type="dxa" w:w="4608"/>
+            <w:tcW w:type="dxa" w:w="2592"/>
             <w:shd w:fill="FFFFFF"/>
             <w:tcMar>
               <w:top w:w="90" w:type="dxa"/>
@@ -204,7 +283,32 @@
                 <w:color w:val="222222"/>
                 <w:sz w:val="18"/>
               </w:rPr>
-              <w:t>23MIS0070 | 23mis0070@vitstudent.ac.in</w:t>
+              <w:t>23MIS0070</w:t>
+            </w:r>
+          </w:p>
+        </w:tc>
+        <w:tc>
+          <w:tcPr>
+            <w:tcW w:type="dxa" w:w="3744"/>
+            <w:shd w:fill="FFFFFF"/>
+            <w:tcMar>
+              <w:top w:w="90" w:type="dxa"/>
+              <w:bottom w:w="90" w:type="dxa"/>
+              <w:left w:w="130" w:type="dxa"/>
+              <w:right w:w="130" w:type="dxa"/>
+            </w:tcMar>
+          </w:tcPr>
+          <w:p>
+            <w:pPr>
+              <w:jc w:val="left"/>
+            </w:pPr>
+            <w:r>
+              <w:rPr>
+                <w:rFonts w:ascii="Segoe UI" w:hAnsi="Segoe UI"/>
+                <w:color w:val="222222"/>
+                <w:sz w:val="18"/>
+              </w:rPr>
+              <w:t>Lead Architect &amp; Build Engineer (Validator.java, Maven CI)</w:t>
             </w:r>
           </w:p>
         </w:tc>
@@ -212,7 +316,7 @@
       <w:tr>
         <w:tc>
           <w:tcPr>
-            <w:tcW w:type="dxa" w:w="4608"/>
+            <w:tcW w:type="dxa" w:w="2880"/>
             <w:shd w:fill="F8FAFC"/>
             <w:tcMar>
               <w:top w:w="90" w:type="dxa"/>
@@ -237,7 +341,7 @@
         </w:tc>
         <w:tc>
           <w:tcPr>
-            <w:tcW w:type="dxa" w:w="4608"/>
+            <w:tcW w:type="dxa" w:w="2592"/>
             <w:shd w:fill="F8FAFC"/>
             <w:tcMar>
               <w:top w:w="90" w:type="dxa"/>
@@ -256,7 +360,186 @@
                 <w:color w:val="222222"/>
                 <w:sz w:val="18"/>
               </w:rPr>
-              <w:t>23MIS0180 | 23mis0180@vitstudent.ac.in</w:t>
+              <w:t>23MIS0180</w:t>
+            </w:r>
+          </w:p>
+        </w:tc>
+        <w:tc>
+          <w:tcPr>
+            <w:tcW w:type="dxa" w:w="3744"/>
+            <w:shd w:fill="F8FAFC"/>
+            <w:tcMar>
+              <w:top w:w="90" w:type="dxa"/>
+              <w:bottom w:w="90" w:type="dxa"/>
+              <w:left w:w="130" w:type="dxa"/>
+              <w:right w:w="130" w:type="dxa"/>
+            </w:tcMar>
+          </w:tcPr>
+          <w:p>
+            <w:pPr>
+              <w:jc w:val="left"/>
+            </w:pPr>
+            <w:r>
+              <w:rPr>
+                <w:rFonts w:ascii="Segoe UI" w:hAnsi="Segoe UI"/>
+                <w:color w:val="222222"/>
+                <w:sz w:val="18"/>
+              </w:rPr>
+              <w:t>SCM Contributor &amp; Developer (Calculator.java, Attribution Scorer)</w:t>
+            </w:r>
+          </w:p>
+        </w:tc>
+      </w:tr>
+      <w:tr>
+        <w:tc>
+          <w:tcPr>
+            <w:tcW w:type="dxa" w:w="2880"/>
+            <w:shd w:fill="FFFFFF"/>
+            <w:tcMar>
+              <w:top w:w="90" w:type="dxa"/>
+              <w:bottom w:w="90" w:type="dxa"/>
+              <w:left w:w="130" w:type="dxa"/>
+              <w:right w:w="130" w:type="dxa"/>
+            </w:tcMar>
+          </w:tcPr>
+          <w:p>
+            <w:pPr>
+              <w:jc w:val="left"/>
+            </w:pPr>
+            <w:r>
+              <w:rPr>
+                <w:rFonts w:ascii="Segoe UI" w:hAnsi="Segoe UI"/>
+                <w:color w:val="222222"/>
+                <w:sz w:val="18"/>
+              </w:rPr>
+              <w:t>Arun Kumar</w:t>
+            </w:r>
+          </w:p>
+        </w:tc>
+        <w:tc>
+          <w:tcPr>
+            <w:tcW w:type="dxa" w:w="2592"/>
+            <w:shd w:fill="FFFFFF"/>
+            <w:tcMar>
+              <w:top w:w="90" w:type="dxa"/>
+              <w:bottom w:w="90" w:type="dxa"/>
+              <w:left w:w="130" w:type="dxa"/>
+              <w:right w:w="130" w:type="dxa"/>
+            </w:tcMar>
+          </w:tcPr>
+          <w:p>
+            <w:pPr>
+              <w:jc w:val="left"/>
+            </w:pPr>
+            <w:r>
+              <w:rPr>
+                <w:rFonts w:ascii="Segoe UI" w:hAnsi="Segoe UI"/>
+                <w:color w:val="222222"/>
+                <w:sz w:val="18"/>
+              </w:rPr>
+              <w:t>23MIS0245</w:t>
+            </w:r>
+          </w:p>
+        </w:tc>
+        <w:tc>
+          <w:tcPr>
+            <w:tcW w:type="dxa" w:w="3744"/>
+            <w:shd w:fill="FFFFFF"/>
+            <w:tcMar>
+              <w:top w:w="90" w:type="dxa"/>
+              <w:bottom w:w="90" w:type="dxa"/>
+              <w:left w:w="130" w:type="dxa"/>
+              <w:right w:w="130" w:type="dxa"/>
+            </w:tcMar>
+          </w:tcPr>
+          <w:p>
+            <w:pPr>
+              <w:jc w:val="left"/>
+            </w:pPr>
+            <w:r>
+              <w:rPr>
+                <w:rFonts w:ascii="Segoe UI" w:hAnsi="Segoe UI"/>
+                <w:color w:val="222222"/>
+                <w:sz w:val="18"/>
+              </w:rPr>
+              <w:t>DevOps &amp; SCM Maintainer (scoring_config.yaml, Jenkins CI)</w:t>
+            </w:r>
+          </w:p>
+        </w:tc>
+      </w:tr>
+      <w:tr>
+        <w:tc>
+          <w:tcPr>
+            <w:tcW w:type="dxa" w:w="2880"/>
+            <w:shd w:fill="F8FAFC"/>
+            <w:tcMar>
+              <w:top w:w="90" w:type="dxa"/>
+              <w:bottom w:w="90" w:type="dxa"/>
+              <w:left w:w="130" w:type="dxa"/>
+              <w:right w:w="130" w:type="dxa"/>
+            </w:tcMar>
+          </w:tcPr>
+          <w:p>
+            <w:pPr>
+              <w:jc w:val="left"/>
+            </w:pPr>
+            <w:r>
+              <w:rPr>
+                <w:rFonts w:ascii="Segoe UI" w:hAnsi="Segoe UI"/>
+                <w:color w:val="222222"/>
+                <w:sz w:val="18"/>
+              </w:rPr>
+              <w:t>Kavya Sharma</w:t>
+            </w:r>
+          </w:p>
+        </w:tc>
+        <w:tc>
+          <w:tcPr>
+            <w:tcW w:type="dxa" w:w="2592"/>
+            <w:shd w:fill="F8FAFC"/>
+            <w:tcMar>
+              <w:top w:w="90" w:type="dxa"/>
+              <w:bottom w:w="90" w:type="dxa"/>
+              <w:left w:w="130" w:type="dxa"/>
+              <w:right w:w="130" w:type="dxa"/>
+            </w:tcMar>
+          </w:tcPr>
+          <w:p>
+            <w:pPr>
+              <w:jc w:val="left"/>
+            </w:pPr>
+            <w:r>
+              <w:rPr>
+                <w:rFonts w:ascii="Segoe UI" w:hAnsi="Segoe UI"/>
+                <w:color w:val="222222"/>
+                <w:sz w:val="18"/>
+              </w:rPr>
+              <w:t>23MIS0310</w:t>
+            </w:r>
+          </w:p>
+        </w:tc>
+        <w:tc>
+          <w:tcPr>
+            <w:tcW w:type="dxa" w:w="3744"/>
+            <w:shd w:fill="F8FAFC"/>
+            <w:tcMar>
+              <w:top w:w="90" w:type="dxa"/>
+              <w:bottom w:w="90" w:type="dxa"/>
+              <w:left w:w="130" w:type="dxa"/>
+              <w:right w:w="130" w:type="dxa"/>
+            </w:tcMar>
+          </w:tcPr>
+          <w:p>
+            <w:pPr>
+              <w:jc w:val="left"/>
+            </w:pPr>
+            <w:r>
+              <w:rPr>
+                <w:rFonts w:ascii="Segoe UI" w:hAnsi="Segoe UI"/>
+                <w:color w:val="222222"/>
+                <w:sz w:val="18"/>
+              </w:rPr>
+              <w:t>QA Engineer &amp; SCM Auditor (TEAM_COLLABORATION.md, Test Suites)</w:t>
             </w:r>
           </w:p>
         </w:tc>
@@ -347,7 +630,7 @@
     </w:p>
     <w:p>
       <w:r>
-        <w:t>When the continuous integration build suddenly fails, development teams face a severe bottleneck. Traditional CI tools simply flag the build as 'RED' (Failed) without identifying which developer's commit broke the build. Engineers are forced to fall back on an ad-hoc and dangerous shortcut: 'Blame the last commit.' In reality, the last commit might be completely harmless (e.g., updating documentation or test notes), while an earlier commit in the same batch introduced a subtle calculation or syntax defect.</w:t>
+        <w:t>When the continuous integration build suddenly fails, development teams face a severe bottleneck. Traditional CI tools simply flag the build as 'RED' (Failed) without identifying which developer's commit broke the build. Engineers are forced to fall back on an ad-hoc and dangerous shortcut: 'Blame the last commit.' In reality, the last commit might be completely harmless (e.g., updating documentation or tuning configuration), while an earlier commit in the same batch introduced a subtle calculation or syntax defect.</w:t>
       </w:r>
     </w:p>
     <w:p>
@@ -366,7 +649,7 @@
     </w:p>
     <w:p>
       <w:r>
-        <w:t>To make this project easy to explain and demonstrate during our SCM final review, we implemented and executed a realistic, reproducible multi-developer scenario featuring our two team members:</w:t>
+        <w:t>To make this project easy to explain and demonstrate during our SCM final review, we implemented and executed a realistic, reproducible multi-developer scenario featuring our 4-member project team:</w:t>
       </w:r>
     </w:p>
     <w:tbl>
@@ -376,14 +659,15 @@
         <w:tblLook w:firstColumn="1" w:firstRow="1" w:lastColumn="0" w:lastRow="0" w:noHBand="0" w:noVBand="1" w:val="04A0"/>
       </w:tblPr>
       <w:tblGrid>
-        <w:gridCol w:w="3120"/>
-        <w:gridCol w:w="3120"/>
-        <w:gridCol w:w="3120"/>
+        <w:gridCol w:w="2340"/>
+        <w:gridCol w:w="2340"/>
+        <w:gridCol w:w="2340"/>
+        <w:gridCol w:w="2340"/>
       </w:tblGrid>
       <w:tr>
         <w:tc>
           <w:tcPr>
-            <w:tcW w:type="dxa" w:w="2160"/>
+            <w:tcW w:type="dxa" w:w="1728"/>
             <w:shd w:fill="1E293B"/>
             <w:tcMar>
               <w:top w:w="120" w:type="dxa"/>
@@ -403,13 +687,13 @@
                 <w:color w:val="FFFFFF"/>
                 <w:sz w:val="19"/>
               </w:rPr>
-              <w:t>Role</w:t>
+              <w:t>Developer</w:t>
             </w:r>
           </w:p>
         </w:tc>
         <w:tc>
           <w:tcPr>
-            <w:tcW w:type="dxa" w:w="3168"/>
+            <w:tcW w:type="dxa" w:w="2592"/>
             <w:shd w:fill="1E293B"/>
             <w:tcMar>
               <w:top w:w="120" w:type="dxa"/>
@@ -429,13 +713,13 @@
                 <w:color w:val="FFFFFF"/>
                 <w:sz w:val="19"/>
               </w:rPr>
-              <w:t>Team Member</w:t>
+              <w:t>Member Name &amp; Reg</w:t>
             </w:r>
           </w:p>
         </w:tc>
         <w:tc>
           <w:tcPr>
-            <w:tcW w:type="dxa" w:w="3888"/>
+            <w:tcW w:type="dxa" w:w="2592"/>
             <w:shd w:fill="1E293B"/>
             <w:tcMar>
               <w:top w:w="120" w:type="dxa"/>
@@ -455,7 +739,33 @@
                 <w:color w:val="FFFFFF"/>
                 <w:sz w:val="19"/>
               </w:rPr>
-              <w:t>Responsibility in Demonstration</w:t>
+              <w:t>Assigned Component</w:t>
+            </w:r>
+          </w:p>
+        </w:tc>
+        <w:tc>
+          <w:tcPr>
+            <w:tcW w:type="dxa" w:w="2304"/>
+            <w:shd w:fill="1E293B"/>
+            <w:tcMar>
+              <w:top w:w="120" w:type="dxa"/>
+              <w:bottom w:w="120" w:type="dxa"/>
+              <w:left w:w="140" w:type="dxa"/>
+              <w:right w:w="140" w:type="dxa"/>
+            </w:tcMar>
+          </w:tcPr>
+          <w:p>
+            <w:pPr>
+              <w:jc w:val="left"/>
+            </w:pPr>
+            <w:r>
+              <w:rPr>
+                <w:rFonts w:ascii="Segoe UI" w:hAnsi="Segoe UI"/>
+                <w:b/>
+                <w:color w:val="FFFFFF"/>
+                <w:sz w:val="19"/>
+              </w:rPr>
+              <w:t>Action in Demonstration</w:t>
             </w:r>
           </w:p>
         </w:tc>
@@ -463,7 +773,7 @@
       <w:tr>
         <w:tc>
           <w:tcPr>
-            <w:tcW w:type="dxa" w:w="2160"/>
+            <w:tcW w:type="dxa" w:w="1728"/>
             <w:shd w:fill="FFFFFF"/>
             <w:tcMar>
               <w:top w:w="90" w:type="dxa"/>
@@ -482,13 +792,13 @@
                 <w:color w:val="222222"/>
                 <w:sz w:val="18"/>
               </w:rPr>
-              <w:t>Developer 1</w:t>
+              <w:t>Member 1</w:t>
             </w:r>
           </w:p>
         </w:tc>
         <w:tc>
           <w:tcPr>
-            <w:tcW w:type="dxa" w:w="3168"/>
+            <w:tcW w:type="dxa" w:w="2592"/>
             <w:shd w:fill="FFFFFF"/>
             <w:tcMar>
               <w:top w:w="90" w:type="dxa"/>
@@ -507,15 +817,15 @@
                 <w:color w:val="222222"/>
                 <w:sz w:val="18"/>
               </w:rPr>
-              <w:t>Prakash Raj U (PRU)</w:t>
+              <w:t>Bharathwaraj K S</w:t>
               <w:br/>
-              <w:t>23MIS0180</w:t>
+              <w:t>23MIS0070</w:t>
             </w:r>
           </w:p>
         </w:tc>
         <w:tc>
           <w:tcPr>
-            <w:tcW w:type="dxa" w:w="3888"/>
+            <w:tcW w:type="dxa" w:w="2592"/>
             <w:shd w:fill="FFFFFF"/>
             <w:tcMar>
               <w:top w:w="90" w:type="dxa"/>
@@ -534,9 +844,34 @@
                 <w:color w:val="222222"/>
                 <w:sz w:val="18"/>
               </w:rPr>
-              <w:t>Core Calculation Logic (Calculator.java)</w:t>
+              <w:t>Validator.java</w:t>
               <w:br/>
-              <w:t>Database Schema &amp; Ranking Engine</w:t>
+              <w:t>ValidatorTest.java</w:t>
+            </w:r>
+          </w:p>
+        </w:tc>
+        <w:tc>
+          <w:tcPr>
+            <w:tcW w:type="dxa" w:w="2304"/>
+            <w:shd w:fill="FFFFFF"/>
+            <w:tcMar>
+              <w:top w:w="90" w:type="dxa"/>
+              <w:bottom w:w="90" w:type="dxa"/>
+              <w:left w:w="130" w:type="dxa"/>
+              <w:right w:w="130" w:type="dxa"/>
+            </w:tcMar>
+          </w:tcPr>
+          <w:p>
+            <w:pPr>
+              <w:jc w:val="left"/>
+            </w:pPr>
+            <w:r>
+              <w:rPr>
+                <w:rFonts w:ascii="Segoe UI" w:hAnsi="Segoe UI"/>
+                <w:color w:val="222222"/>
+                <w:sz w:val="18"/>
+              </w:rPr>
+              <w:t>Commits range validation logic (CR-010)</w:t>
             </w:r>
           </w:p>
         </w:tc>
@@ -544,7 +879,7 @@
       <w:tr>
         <w:tc>
           <w:tcPr>
-            <w:tcW w:type="dxa" w:w="2160"/>
+            <w:tcW w:type="dxa" w:w="1728"/>
             <w:shd w:fill="F8FAFC"/>
             <w:tcMar>
               <w:top w:w="90" w:type="dxa"/>
@@ -563,13 +898,13 @@
                 <w:color w:val="222222"/>
                 <w:sz w:val="18"/>
               </w:rPr>
-              <w:t>Developer 2</w:t>
+              <w:t>Member 2</w:t>
             </w:r>
           </w:p>
         </w:tc>
         <w:tc>
           <w:tcPr>
-            <w:tcW w:type="dxa" w:w="3168"/>
+            <w:tcW w:type="dxa" w:w="2592"/>
             <w:shd w:fill="F8FAFC"/>
             <w:tcMar>
               <w:top w:w="90" w:type="dxa"/>
@@ -588,15 +923,15 @@
                 <w:color w:val="222222"/>
                 <w:sz w:val="18"/>
               </w:rPr>
-              <w:t>Bharathwaraj K S (BKS)</w:t>
+              <w:t>Prakash Raj U (Us)</w:t>
               <w:br/>
-              <w:t>23MIS0070</w:t>
+              <w:t>23MIS0180</w:t>
             </w:r>
           </w:p>
         </w:tc>
         <w:tc>
           <w:tcPr>
-            <w:tcW w:type="dxa" w:w="3888"/>
+            <w:tcW w:type="dxa" w:w="2592"/>
             <w:shd w:fill="F8FAFC"/>
             <w:tcMar>
               <w:top w:w="90" w:type="dxa"/>
@@ -615,9 +950,34 @@
                 <w:color w:val="222222"/>
                 <w:sz w:val="18"/>
               </w:rPr>
-              <w:t>Project Documentation &amp; Notes (docs/notes.md)</w:t>
+              <w:t>Calculator.java</w:t>
               <w:br/>
-              <w:t>Jenkins Pipeline, Build Log Parser &amp; CSAR</w:t>
+              <w:t>CalculatorTest.java</w:t>
+            </w:r>
+          </w:p>
+        </w:tc>
+        <w:tc>
+          <w:tcPr>
+            <w:tcW w:type="dxa" w:w="2304"/>
+            <w:shd w:fill="F8FAFC"/>
+            <w:tcMar>
+              <w:top w:w="90" w:type="dxa"/>
+              <w:bottom w:w="90" w:type="dxa"/>
+              <w:left w:w="130" w:type="dxa"/>
+              <w:right w:w="130" w:type="dxa"/>
+            </w:tcMar>
+          </w:tcPr>
+          <w:p>
+            <w:pPr>
+              <w:jc w:val="left"/>
+            </w:pPr>
+            <w:r>
+              <w:rPr>
+                <w:rFonts w:ascii="Segoe UI" w:hAnsi="Segoe UI"/>
+                <w:color w:val="222222"/>
+                <w:sz w:val="18"/>
+              </w:rPr>
+              <w:t>Inadvertently introduces calculation bug (CR-011); alters &amp; fixes defect (CR-014)</w:t>
             </w:r>
           </w:p>
         </w:tc>
@@ -625,7 +985,7 @@
       <w:tr>
         <w:tc>
           <w:tcPr>
-            <w:tcW w:type="dxa" w:w="2160"/>
+            <w:tcW w:type="dxa" w:w="1728"/>
             <w:shd w:fill="FFFFFF"/>
             <w:tcMar>
               <w:top w:w="90" w:type="dxa"/>
@@ -644,13 +1004,13 @@
                 <w:color w:val="222222"/>
                 <w:sz w:val="18"/>
               </w:rPr>
-              <w:t>Reviewer / CCB</w:t>
+              <w:t>Member 3</w:t>
             </w:r>
           </w:p>
         </w:tc>
         <w:tc>
           <w:tcPr>
-            <w:tcW w:type="dxa" w:w="3168"/>
+            <w:tcW w:type="dxa" w:w="2592"/>
             <w:shd w:fill="FFFFFF"/>
             <w:tcMar>
               <w:top w:w="90" w:type="dxa"/>
@@ -669,13 +1029,250 @@
                 <w:color w:val="222222"/>
                 <w:sz w:val="18"/>
               </w:rPr>
-              <w:t>Configuration Control Board (CCB)</w:t>
+              <w:t>Arun Kumar</w:t>
+              <w:br/>
+              <w:t>23MIS0245</w:t>
             </w:r>
           </w:p>
         </w:tc>
         <w:tc>
           <w:tcPr>
-            <w:tcW w:type="dxa" w:w="3888"/>
+            <w:tcW w:type="dxa" w:w="2592"/>
+            <w:shd w:fill="FFFFFF"/>
+            <w:tcMar>
+              <w:top w:w="90" w:type="dxa"/>
+              <w:bottom w:w="90" w:type="dxa"/>
+              <w:left w:w="130" w:type="dxa"/>
+              <w:right w:w="130" w:type="dxa"/>
+            </w:tcMar>
+          </w:tcPr>
+          <w:p>
+            <w:pPr>
+              <w:jc w:val="left"/>
+            </w:pPr>
+            <w:r>
+              <w:rPr>
+                <w:rFonts w:ascii="Segoe UI" w:hAnsi="Segoe UI"/>
+                <w:color w:val="222222"/>
+                <w:sz w:val="18"/>
+              </w:rPr>
+              <w:t>scoring_config.yaml</w:t>
+              <w:br/>
+              <w:t>CI Thresholds</w:t>
+            </w:r>
+          </w:p>
+        </w:tc>
+        <w:tc>
+          <w:tcPr>
+            <w:tcW w:type="dxa" w:w="2304"/>
+            <w:shd w:fill="FFFFFF"/>
+            <w:tcMar>
+              <w:top w:w="90" w:type="dxa"/>
+              <w:bottom w:w="90" w:type="dxa"/>
+              <w:left w:w="130" w:type="dxa"/>
+              <w:right w:w="130" w:type="dxa"/>
+            </w:tcMar>
+          </w:tcPr>
+          <w:p>
+            <w:pPr>
+              <w:jc w:val="left"/>
+            </w:pPr>
+            <w:r>
+              <w:rPr>
+                <w:rFonts w:ascii="Segoe UI" w:hAnsi="Segoe UI"/>
+                <w:color w:val="222222"/>
+                <w:sz w:val="18"/>
+              </w:rPr>
+              <w:t>Commits scoring weight configuration tuning (CR-012)</w:t>
+            </w:r>
+          </w:p>
+        </w:tc>
+      </w:tr>
+      <w:tr>
+        <w:tc>
+          <w:tcPr>
+            <w:tcW w:type="dxa" w:w="1728"/>
+            <w:shd w:fill="F8FAFC"/>
+            <w:tcMar>
+              <w:top w:w="90" w:type="dxa"/>
+              <w:bottom w:w="90" w:type="dxa"/>
+              <w:left w:w="130" w:type="dxa"/>
+              <w:right w:w="130" w:type="dxa"/>
+            </w:tcMar>
+          </w:tcPr>
+          <w:p>
+            <w:pPr>
+              <w:jc w:val="left"/>
+            </w:pPr>
+            <w:r>
+              <w:rPr>
+                <w:rFonts w:ascii="Segoe UI" w:hAnsi="Segoe UI"/>
+                <w:color w:val="222222"/>
+                <w:sz w:val="18"/>
+              </w:rPr>
+              <w:t>Member 4</w:t>
+            </w:r>
+          </w:p>
+        </w:tc>
+        <w:tc>
+          <w:tcPr>
+            <w:tcW w:type="dxa" w:w="2592"/>
+            <w:shd w:fill="F8FAFC"/>
+            <w:tcMar>
+              <w:top w:w="90" w:type="dxa"/>
+              <w:bottom w:w="90" w:type="dxa"/>
+              <w:left w:w="130" w:type="dxa"/>
+              <w:right w:w="130" w:type="dxa"/>
+            </w:tcMar>
+          </w:tcPr>
+          <w:p>
+            <w:pPr>
+              <w:jc w:val="left"/>
+            </w:pPr>
+            <w:r>
+              <w:rPr>
+                <w:rFonts w:ascii="Segoe UI" w:hAnsi="Segoe UI"/>
+                <w:color w:val="222222"/>
+                <w:sz w:val="18"/>
+              </w:rPr>
+              <w:t>Kavya Sharma</w:t>
+              <w:br/>
+              <w:t>23MIS0310</w:t>
+            </w:r>
+          </w:p>
+        </w:tc>
+        <w:tc>
+          <w:tcPr>
+            <w:tcW w:type="dxa" w:w="2592"/>
+            <w:shd w:fill="F8FAFC"/>
+            <w:tcMar>
+              <w:top w:w="90" w:type="dxa"/>
+              <w:bottom w:w="90" w:type="dxa"/>
+              <w:left w:w="130" w:type="dxa"/>
+              <w:right w:w="130" w:type="dxa"/>
+            </w:tcMar>
+          </w:tcPr>
+          <w:p>
+            <w:pPr>
+              <w:jc w:val="left"/>
+            </w:pPr>
+            <w:r>
+              <w:rPr>
+                <w:rFonts w:ascii="Segoe UI" w:hAnsi="Segoe UI"/>
+                <w:color w:val="222222"/>
+                <w:sz w:val="18"/>
+              </w:rPr>
+              <w:t>docs/TEAM_COLLABORATION.md</w:t>
+              <w:br/>
+              <w:t>Test Matrix</w:t>
+            </w:r>
+          </w:p>
+        </w:tc>
+        <w:tc>
+          <w:tcPr>
+            <w:tcW w:type="dxa" w:w="2304"/>
+            <w:shd w:fill="F8FAFC"/>
+            <w:tcMar>
+              <w:top w:w="90" w:type="dxa"/>
+              <w:bottom w:w="90" w:type="dxa"/>
+              <w:left w:w="130" w:type="dxa"/>
+              <w:right w:w="130" w:type="dxa"/>
+            </w:tcMar>
+          </w:tcPr>
+          <w:p>
+            <w:pPr>
+              <w:jc w:val="left"/>
+            </w:pPr>
+            <w:r>
+              <w:rPr>
+                <w:rFonts w:ascii="Segoe UI" w:hAnsi="Segoe UI"/>
+                <w:color w:val="222222"/>
+                <w:sz w:val="18"/>
+              </w:rPr>
+              <w:t>Commits team collaboration guidelines and test matrix (CR-013)</w:t>
+            </w:r>
+          </w:p>
+        </w:tc>
+      </w:tr>
+      <w:tr>
+        <w:tc>
+          <w:tcPr>
+            <w:tcW w:type="dxa" w:w="1728"/>
+            <w:shd w:fill="FFFFFF"/>
+            <w:tcMar>
+              <w:top w:w="90" w:type="dxa"/>
+              <w:bottom w:w="90" w:type="dxa"/>
+              <w:left w:w="130" w:type="dxa"/>
+              <w:right w:w="130" w:type="dxa"/>
+            </w:tcMar>
+          </w:tcPr>
+          <w:p>
+            <w:pPr>
+              <w:jc w:val="left"/>
+            </w:pPr>
+            <w:r>
+              <w:rPr>
+                <w:rFonts w:ascii="Segoe UI" w:hAnsi="Segoe UI"/>
+                <w:color w:val="222222"/>
+                <w:sz w:val="18"/>
+              </w:rPr>
+              <w:t>CCB / Reviewer</w:t>
+            </w:r>
+          </w:p>
+        </w:tc>
+        <w:tc>
+          <w:tcPr>
+            <w:tcW w:type="dxa" w:w="2592"/>
+            <w:shd w:fill="FFFFFF"/>
+            <w:tcMar>
+              <w:top w:w="90" w:type="dxa"/>
+              <w:bottom w:w="90" w:type="dxa"/>
+              <w:left w:w="130" w:type="dxa"/>
+              <w:right w:w="130" w:type="dxa"/>
+            </w:tcMar>
+          </w:tcPr>
+          <w:p>
+            <w:pPr>
+              <w:jc w:val="left"/>
+            </w:pPr>
+            <w:r>
+              <w:rPr>
+                <w:rFonts w:ascii="Segoe UI" w:hAnsi="Segoe UI"/>
+                <w:color w:val="222222"/>
+                <w:sz w:val="18"/>
+              </w:rPr>
+              <w:t>Configuration Control Board</w:t>
+            </w:r>
+          </w:p>
+        </w:tc>
+        <w:tc>
+          <w:tcPr>
+            <w:tcW w:type="dxa" w:w="2592"/>
+            <w:shd w:fill="FFFFFF"/>
+            <w:tcMar>
+              <w:top w:w="90" w:type="dxa"/>
+              <w:bottom w:w="90" w:type="dxa"/>
+              <w:left w:w="130" w:type="dxa"/>
+              <w:right w:w="130" w:type="dxa"/>
+            </w:tcMar>
+          </w:tcPr>
+          <w:p>
+            <w:pPr>
+              <w:jc w:val="left"/>
+            </w:pPr>
+            <w:r>
+              <w:rPr>
+                <w:rFonts w:ascii="Segoe UI" w:hAnsi="Segoe UI"/>
+                <w:color w:val="222222"/>
+                <w:sz w:val="18"/>
+              </w:rPr>
+              <w:t>Change Control &amp; Gatekeeping</w:t>
+            </w:r>
+          </w:p>
+        </w:tc>
+        <w:tc>
+          <w:tcPr>
+            <w:tcW w:type="dxa" w:w="2304"/>
             <w:shd w:fill="FFFFFF"/>
             <w:tcMar>
               <w:top w:w="90" w:type="dxa"/>
@@ -717,22 +1314,30 @@
       <w:r>
         <w:t>Step 1: Baseline Establishment (Clean State)</w:t>
         <w:br/>
-        <w:t>Both developers start from an approved baseline (BL-04 / tag v0.2.0) on the integration branch ('develop'). Maven clean compilation and JUnit 5 tests execute: all 7 unit tests pass. Jenkins records Build #101 as SUCCESS.</w:t>
+        <w:t>All 4 developers start from an approved baseline (BL-04 / tag v0.2.0) on the integration branch ('develop'). Maven clean compilation and JUnit 5 tests execute: all unit tests pass. Jenkins records Build #101 as SUCCESS.</w:t>
       </w:r>
     </w:p>
     <w:p>
       <w:r>
         <w:t>Step 2: Concurrent Multi-Developer Commits (The Seeded Batch)</w:t>
         <w:br/>
-        <w:t>Both developers work simultaneously on the repository during the same CI interval:</w:t>
+        <w:t>All 4 team members push code during the same sprint batch window before the CI pipeline triggers:</w:t>
         <w:br/>
-        <w:t>• Commit 1 (Prakash Raj U - Hash: 9297e33):</w:t>
+        <w:t>• Commit 1 (Bharathwaraj K S - Hash: d6b3be0):</w:t>
         <w:br/>
-        <w:t xml:space="preserve">  Prakash modifies Calculator.java to change 'return a + b;' to 'return a + b + 1;'.   Commit message: 'CR-009: introduce controlled calculation failure in Calculator add method'.</w:t>
+        <w:t xml:space="preserve">  Adds range validation method isInRange() to Validator.java and unit test. Commit: 'CR-010: add range validation logic to Validator'.</w:t>
         <w:br/>
-        <w:t>• Commit 2 (Bharathwaraj K S - Hash: 63e1e5b - HEAD):</w:t>
+        <w:t>• Commit 2 (Prakash Raj U - Hash: 077e17c):</w:t>
         <w:br/>
-        <w:t xml:space="preserve">  A few minutes later, Bharathwaraj updates docs/notes.md with regression test notes.   Commit message: 'CR-009: update project notes for regression testing'.</w:t>
+        <w:t xml:space="preserve">  Prakash modifies Calculator.java to change 'return a + b;' to 'return a + b + 1;' (DEFECT SEEDED). Commit: 'CR-011: update calculation logic in Calculator add method'.</w:t>
+        <w:br/>
+        <w:t>• Commit 3 (Arun Kumar - Hash: 4025917):</w:t>
+        <w:br/>
+        <w:t xml:space="preserve">  Tunes attribution scoring weights in scoring_config.yaml. Commit: 'CR-012: tune attribution scoring weights and thresholds'.</w:t>
+        <w:br/>
+        <w:t>• Commit 4 (Kavya Sharma - Hash: 5fbf9c0 - HEAD):</w:t>
+        <w:br/>
+        <w:t xml:space="preserve">  Adds team collaboration and CI test matrix in docs/TEAM_COLLABORATION.md. Commit: 'CR-013: add collaborative team workflow and CI test matrix'.</w:t>
       </w:r>
     </w:p>
     <w:tbl>
@@ -782,7 +1387,7 @@
                 <w:color w:val="222222"/>
                 <w:sz w:val="20"/>
               </w:rPr>
-              <w:t>Notice that Bharathwaraj's commit (63e1e5b) is the LATEST commit (HEAD). If a project team uses a simple 'blame the last committer' heuristic, Bharathwaraj would be wrongly accused of breaking the build, even though he only added two lines of markdown documentation! This wastes engineering time and damages team morale.</w:t>
+              <w:t>Notice that Kavya Sharma's commit (5fbf9c0) is the LATEST commit (HEAD). If a project team uses a simple 'blame the last committer' heuristic, Kavya would be wrongly accused of breaking the build, even though she only added documentation! CommitSleuth prevents this false accusation by evaluating semantic file overlaps across all 4 developers.</w:t>
             </w:r>
           </w:p>
         </w:tc>
@@ -795,9 +1400,9 @@
     </w:p>
     <w:p>
       <w:r>
-        <w:t>Step 3: Jenkins CI Trigger &amp; Maven Failure</w:t>
+        <w:t>Step 3: Jenkins CI Trigger &amp; Maven Build Failure</w:t>
         <w:br/>
-        <w:t>Jenkins checks out the batch containing both commits. Maven executes unit tests. The test 'CalculatorTest.addsTwoNumbers' asserts that add(2, 3) must equal 5, but receives 6. The build fails with exit code 1. Jenkins records Build #102 as FAILURE.</w:t>
+        <w:t>Jenkins checks out the batch containing all 4 commits. Maven executes unit tests. ValidatorTest passes completely, but CalculatorTest.addsTwoNumbers fails (expected &lt;5&gt; but was: &lt;6&gt;). The build breaks with exit code 1. Jenkins records Build #102 as FAILURE.</w:t>
       </w:r>
     </w:p>
     <w:p>
@@ -806,11 +1411,11 @@
         <w:br/>
         <w:t>Jenkins invokes CommitSleuth's analyzer agent (record_build.py). CommitSleuth executes the following logic:</w:t>
         <w:br/>
-        <w:t>1. Intercepts build.log and parses the error using log_parser.py. It identifies failure_type = 'test',    affected test = 'CalculatorTest.addsTwoNumbers', and correlates the affected source class to 'Calculator.java'.</w:t>
+        <w:t>1. Intercepts build.log and parses the error using log_parser.py: identifies failure_type = 'test',    affected test = 'CalculatorTest.addsTwoNumbers', and correlates the affected source class to 'Calculator.java'.</w:t>
         <w:br/>
-        <w:t>2. Extracts all candidate commits since the last passing build (Build #101) up to HEAD: both 9297e33 and 63e1e5b.</w:t>
+        <w:t>2. Extracts all 4 candidate commits since the last passing build (Build #101) up to HEAD.</w:t>
         <w:br/>
-        <w:t>3. Evaluates both commits against the multi-factor scoring model in scorer.py.</w:t>
+        <w:t>3. Evaluates all 4 commits against the multi-factor scoring model in scorer.py.</w:t>
       </w:r>
     </w:p>
     <w:tbl>
@@ -1007,9 +1612,9 @@
                 <w:color w:val="222222"/>
                 <w:sz w:val="18"/>
               </w:rPr>
-              <w:t>9297e33</w:t>
+              <w:t>077e17c</w:t>
               <w:br/>
-              <w:t>(Earlier)</w:t>
+              <w:t>(Defect)</w:t>
             </w:r>
           </w:p>
         </w:tc>
@@ -1086,9 +1691,7 @@
                 <w:color w:val="222222"/>
                 <w:sz w:val="18"/>
               </w:rPr>
-              <w:t>77.8%</w:t>
-              <w:br/>
-              <w:t>(0.778)</w:t>
+              <w:t>75.3%</w:t>
             </w:r>
           </w:p>
         </w:tc>
@@ -1113,7 +1716,7 @@
                 <w:color w:val="222222"/>
                 <w:sz w:val="18"/>
               </w:rPr>
-              <w:t>PROBABLE CAUSE</w:t>
+              <w:t>PROBABLE CAUSE (Rank #1)</w:t>
             </w:r>
           </w:p>
         </w:tc>
@@ -1138,7 +1741,7 @@
                 <w:color w:val="222222"/>
                 <w:sz w:val="18"/>
               </w:rPr>
-              <w:t>Direct match with affected file 'Calculator.java' (+0.50); Recency 1/2 (+0.07); Scope 1 file (+0.02)</w:t>
+              <w:t>Direct match with affected file 'Calculator.java' (+0.55); Recency (+0.06); Scope 1 file (+0.02)</w:t>
             </w:r>
           </w:p>
         </w:tc>
@@ -1165,9 +1768,7 @@
                 <w:color w:val="222222"/>
                 <w:sz w:val="18"/>
               </w:rPr>
-              <w:t>63e1e5b</w:t>
-              <w:br/>
-              <w:t>(Latest)</w:t>
+              <w:t>d6b3be0</w:t>
             </w:r>
           </w:p>
         </w:tc>
@@ -1217,9 +1818,9 @@
                 <w:color w:val="222222"/>
                 <w:sz w:val="18"/>
               </w:rPr>
-              <w:t>docs/notes.md</w:t>
+              <w:t>Validator.java</w:t>
               <w:br/>
-              <w:t>(1 file)</w:t>
+              <w:t>(2 files)</w:t>
             </w:r>
           </w:p>
         </w:tc>
@@ -1244,9 +1845,7 @@
                 <w:color w:val="222222"/>
                 <w:sz w:val="18"/>
               </w:rPr>
-              <w:t>22.2%</w:t>
-              <w:br/>
-              <w:t>(0.222)</w:t>
+              <w:t>10.0%</w:t>
             </w:r>
           </w:p>
         </w:tc>
@@ -1296,7 +1895,317 @@
                 <w:color w:val="222222"/>
                 <w:sz w:val="18"/>
               </w:rPr>
-              <w:t>Commit recency 2/2 (+0.15); Scope 1 file (+0.02); No code/error file overlap</w:t>
+              <w:t>Non-culpable: ValidatorTest passed; zero overlap with failing test assertion</w:t>
+            </w:r>
+          </w:p>
+        </w:tc>
+      </w:tr>
+      <w:tr>
+        <w:tc>
+          <w:tcPr>
+            <w:tcW w:type="dxa" w:w="1440"/>
+            <w:shd w:fill="FFFFFF"/>
+            <w:tcMar>
+              <w:top w:w="90" w:type="dxa"/>
+              <w:bottom w:w="90" w:type="dxa"/>
+              <w:left w:w="130" w:type="dxa"/>
+              <w:right w:w="130" w:type="dxa"/>
+            </w:tcMar>
+          </w:tcPr>
+          <w:p>
+            <w:pPr>
+              <w:jc w:val="left"/>
+            </w:pPr>
+            <w:r>
+              <w:rPr>
+                <w:rFonts w:ascii="Segoe UI" w:hAnsi="Segoe UI"/>
+                <w:color w:val="222222"/>
+                <w:sz w:val="18"/>
+              </w:rPr>
+              <w:t>4025917</w:t>
+            </w:r>
+          </w:p>
+        </w:tc>
+        <w:tc>
+          <w:tcPr>
+            <w:tcW w:type="dxa" w:w="1872"/>
+            <w:shd w:fill="FFFFFF"/>
+            <w:tcMar>
+              <w:top w:w="90" w:type="dxa"/>
+              <w:bottom w:w="90" w:type="dxa"/>
+              <w:left w:w="130" w:type="dxa"/>
+              <w:right w:w="130" w:type="dxa"/>
+            </w:tcMar>
+          </w:tcPr>
+          <w:p>
+            <w:pPr>
+              <w:jc w:val="left"/>
+            </w:pPr>
+            <w:r>
+              <w:rPr>
+                <w:rFonts w:ascii="Segoe UI" w:hAnsi="Segoe UI"/>
+                <w:color w:val="222222"/>
+                <w:sz w:val="18"/>
+              </w:rPr>
+              <w:t>Arun Kumar</w:t>
+            </w:r>
+          </w:p>
+        </w:tc>
+        <w:tc>
+          <w:tcPr>
+            <w:tcW w:type="dxa" w:w="1728"/>
+            <w:shd w:fill="FFFFFF"/>
+            <w:tcMar>
+              <w:top w:w="90" w:type="dxa"/>
+              <w:bottom w:w="90" w:type="dxa"/>
+              <w:left w:w="130" w:type="dxa"/>
+              <w:right w:w="130" w:type="dxa"/>
+            </w:tcMar>
+          </w:tcPr>
+          <w:p>
+            <w:pPr>
+              <w:jc w:val="left"/>
+            </w:pPr>
+            <w:r>
+              <w:rPr>
+                <w:rFonts w:ascii="Segoe UI" w:hAnsi="Segoe UI"/>
+                <w:color w:val="222222"/>
+                <w:sz w:val="18"/>
+              </w:rPr>
+              <w:t>scoring_config.yaml</w:t>
+              <w:br/>
+              <w:t>(1 file)</w:t>
+            </w:r>
+          </w:p>
+        </w:tc>
+        <w:tc>
+          <w:tcPr>
+            <w:tcW w:type="dxa" w:w="1296"/>
+            <w:shd w:fill="FFFFFF"/>
+            <w:tcMar>
+              <w:top w:w="90" w:type="dxa"/>
+              <w:bottom w:w="90" w:type="dxa"/>
+              <w:left w:w="130" w:type="dxa"/>
+              <w:right w:w="130" w:type="dxa"/>
+            </w:tcMar>
+          </w:tcPr>
+          <w:p>
+            <w:pPr>
+              <w:jc w:val="left"/>
+            </w:pPr>
+            <w:r>
+              <w:rPr>
+                <w:rFonts w:ascii="Segoe UI" w:hAnsi="Segoe UI"/>
+                <w:color w:val="222222"/>
+                <w:sz w:val="18"/>
+              </w:rPr>
+              <w:t>9.8%</w:t>
+            </w:r>
+          </w:p>
+        </w:tc>
+        <w:tc>
+          <w:tcPr>
+            <w:tcW w:type="dxa" w:w="1440"/>
+            <w:shd w:fill="FFFFFF"/>
+            <w:tcMar>
+              <w:top w:w="90" w:type="dxa"/>
+              <w:bottom w:w="90" w:type="dxa"/>
+              <w:left w:w="130" w:type="dxa"/>
+              <w:right w:w="130" w:type="dxa"/>
+            </w:tcMar>
+          </w:tcPr>
+          <w:p>
+            <w:pPr>
+              <w:jc w:val="left"/>
+            </w:pPr>
+            <w:r>
+              <w:rPr>
+                <w:rFonts w:ascii="Segoe UI" w:hAnsi="Segoe UI"/>
+                <w:color w:val="222222"/>
+                <w:sz w:val="18"/>
+              </w:rPr>
+              <w:t>UNLIKELY CAUSE</w:t>
+            </w:r>
+          </w:p>
+        </w:tc>
+        <w:tc>
+          <w:tcPr>
+            <w:tcW w:type="dxa" w:w="1728"/>
+            <w:shd w:fill="FFFFFF"/>
+            <w:tcMar>
+              <w:top w:w="90" w:type="dxa"/>
+              <w:bottom w:w="90" w:type="dxa"/>
+              <w:left w:w="130" w:type="dxa"/>
+              <w:right w:w="130" w:type="dxa"/>
+            </w:tcMar>
+          </w:tcPr>
+          <w:p>
+            <w:pPr>
+              <w:jc w:val="left"/>
+            </w:pPr>
+            <w:r>
+              <w:rPr>
+                <w:rFonts w:ascii="Segoe UI" w:hAnsi="Segoe UI"/>
+                <w:color w:val="222222"/>
+                <w:sz w:val="18"/>
+              </w:rPr>
+              <w:t>Non-culpable: Configuration modification only; no Java source code changed</w:t>
+            </w:r>
+          </w:p>
+        </w:tc>
+      </w:tr>
+      <w:tr>
+        <w:tc>
+          <w:tcPr>
+            <w:tcW w:type="dxa" w:w="1440"/>
+            <w:shd w:fill="F8FAFC"/>
+            <w:tcMar>
+              <w:top w:w="90" w:type="dxa"/>
+              <w:bottom w:w="90" w:type="dxa"/>
+              <w:left w:w="130" w:type="dxa"/>
+              <w:right w:w="130" w:type="dxa"/>
+            </w:tcMar>
+          </w:tcPr>
+          <w:p>
+            <w:pPr>
+              <w:jc w:val="left"/>
+            </w:pPr>
+            <w:r>
+              <w:rPr>
+                <w:rFonts w:ascii="Segoe UI" w:hAnsi="Segoe UI"/>
+                <w:color w:val="222222"/>
+                <w:sz w:val="18"/>
+              </w:rPr>
+              <w:t>5fbf9c0</w:t>
+              <w:br/>
+              <w:t>(HEAD)</w:t>
+            </w:r>
+          </w:p>
+        </w:tc>
+        <w:tc>
+          <w:tcPr>
+            <w:tcW w:type="dxa" w:w="1872"/>
+            <w:shd w:fill="F8FAFC"/>
+            <w:tcMar>
+              <w:top w:w="90" w:type="dxa"/>
+              <w:bottom w:w="90" w:type="dxa"/>
+              <w:left w:w="130" w:type="dxa"/>
+              <w:right w:w="130" w:type="dxa"/>
+            </w:tcMar>
+          </w:tcPr>
+          <w:p>
+            <w:pPr>
+              <w:jc w:val="left"/>
+            </w:pPr>
+            <w:r>
+              <w:rPr>
+                <w:rFonts w:ascii="Segoe UI" w:hAnsi="Segoe UI"/>
+                <w:color w:val="222222"/>
+                <w:sz w:val="18"/>
+              </w:rPr>
+              <w:t>Kavya Sharma</w:t>
+            </w:r>
+          </w:p>
+        </w:tc>
+        <w:tc>
+          <w:tcPr>
+            <w:tcW w:type="dxa" w:w="1728"/>
+            <w:shd w:fill="F8FAFC"/>
+            <w:tcMar>
+              <w:top w:w="90" w:type="dxa"/>
+              <w:bottom w:w="90" w:type="dxa"/>
+              <w:left w:w="130" w:type="dxa"/>
+              <w:right w:w="130" w:type="dxa"/>
+            </w:tcMar>
+          </w:tcPr>
+          <w:p>
+            <w:pPr>
+              <w:jc w:val="left"/>
+            </w:pPr>
+            <w:r>
+              <w:rPr>
+                <w:rFonts w:ascii="Segoe UI" w:hAnsi="Segoe UI"/>
+                <w:color w:val="222222"/>
+                <w:sz w:val="18"/>
+              </w:rPr>
+              <w:t>TEAM_COLLABORATION.md</w:t>
+              <w:br/>
+              <w:t>(1 file)</w:t>
+            </w:r>
+          </w:p>
+        </w:tc>
+        <w:tc>
+          <w:tcPr>
+            <w:tcW w:type="dxa" w:w="1296"/>
+            <w:shd w:fill="F8FAFC"/>
+            <w:tcMar>
+              <w:top w:w="90" w:type="dxa"/>
+              <w:bottom w:w="90" w:type="dxa"/>
+              <w:left w:w="130" w:type="dxa"/>
+              <w:right w:w="130" w:type="dxa"/>
+            </w:tcMar>
+          </w:tcPr>
+          <w:p>
+            <w:pPr>
+              <w:jc w:val="left"/>
+            </w:pPr>
+            <w:r>
+              <w:rPr>
+                <w:rFonts w:ascii="Segoe UI" w:hAnsi="Segoe UI"/>
+                <w:color w:val="222222"/>
+                <w:sz w:val="18"/>
+              </w:rPr>
+              <w:t>4.9%</w:t>
+            </w:r>
+          </w:p>
+        </w:tc>
+        <w:tc>
+          <w:tcPr>
+            <w:tcW w:type="dxa" w:w="1440"/>
+            <w:shd w:fill="F8FAFC"/>
+            <w:tcMar>
+              <w:top w:w="90" w:type="dxa"/>
+              <w:bottom w:w="90" w:type="dxa"/>
+              <w:left w:w="130" w:type="dxa"/>
+              <w:right w:w="130" w:type="dxa"/>
+            </w:tcMar>
+          </w:tcPr>
+          <w:p>
+            <w:pPr>
+              <w:jc w:val="left"/>
+            </w:pPr>
+            <w:r>
+              <w:rPr>
+                <w:rFonts w:ascii="Segoe UI" w:hAnsi="Segoe UI"/>
+                <w:color w:val="222222"/>
+                <w:sz w:val="18"/>
+              </w:rPr>
+              <w:t>UNLIKELY CAUSE</w:t>
+            </w:r>
+          </w:p>
+        </w:tc>
+        <w:tc>
+          <w:tcPr>
+            <w:tcW w:type="dxa" w:w="1728"/>
+            <w:shd w:fill="F8FAFC"/>
+            <w:tcMar>
+              <w:top w:w="90" w:type="dxa"/>
+              <w:bottom w:w="90" w:type="dxa"/>
+              <w:left w:w="130" w:type="dxa"/>
+              <w:right w:w="130" w:type="dxa"/>
+            </w:tcMar>
+          </w:tcPr>
+          <w:p>
+            <w:pPr>
+              <w:jc w:val="left"/>
+            </w:pPr>
+            <w:r>
+              <w:rPr>
+                <w:rFonts w:ascii="Segoe UI" w:hAnsi="Segoe UI"/>
+                <w:color w:val="222222"/>
+                <w:sz w:val="18"/>
+              </w:rPr>
+              <w:t>Non-culpable: Pure markdown documentation; zero executable code impact</w:t>
             </w:r>
           </w:p>
         </w:tc>
@@ -1311,25 +2220,21 @@
       <w:r>
         <w:t>Step 5: Rollback Advisory &amp; Problem Registration</w:t>
         <w:br/>
-        <w:t>Because Prakash's commit achieved 77.8% confidence (exceeding the 60% threshold) and touched only 1 file (satisfying the &lt;= 3 file isolation check), CommitSleuth produced the automated advisory:</w:t>
-        <w:br/>
-        <w:t xml:space="preserve">   'Rollback recommended: git revert 9297e33 (isolated change of 1 files, confidence 77.8%)'</w:t>
-        <w:br/>
-        <w:t>Problem P-001 is registered in the database, assigned to Prakash Raj U, and displayed on the web dashboard.</w:t>
+        <w:t>CommitSleuth correctly isolates Prakash Raj U as the sole probable cause of the build failure. Because the defect was isolated to 1 file (&lt;= 3 files limit), CommitSleuth generates an automated rollback recommendation: 'Rollback recommended: git revert 077e17c'. Problem P-001/P-002 is registered in SQLite, assigned to Prakash Raj U, and an automated notification is sent to 23mis0180@vitstudent.ac.in.</w:t>
       </w:r>
     </w:p>
     <w:p>
       <w:r>
-        <w:t>Step 6: Defect Resolution &amp; Verification</w:t>
+        <w:t>Step 6: Defect Alteration &amp; Verification</w:t>
         <w:br/>
-        <w:t>Prakash accepts the assignment, updates Calculator.java to restore 'return a + b;', and commits the fix with traceable Change Request reference: 'CR-009: fix calculator add function and restore passing build' (e789c77). Maven re-runs tests: 7/7 tests pass. Jenkins records Build #103 as SUCCESS. Problem P-001 status is updated to CLOSED.</w:t>
+        <w:t>Prakash Raj U receives the notification, investigates Calculator.java, and ALTERS the defect by restoring 'return a + b;'. Prakash commits the fix: 'CR-014: alter and resolve build failure in Calculator add method by Prakash Raj U' (c9223ea). Jenkins re-executes Maven: 8/8 tests pass (100% green). Jenkins records Build #103 as SUCCESS. Problem ticket is CLOSED.</w:t>
       </w:r>
     </w:p>
     <w:p>
       <w:r>
         <w:t>Step 7: SCM Promotion &amp; Release Baselining</w:t>
         <w:br/>
-        <w:t>The verified branch is merged into 'main'. The CCB evaluates the SCM Promotion Gate (promote.py). Because automated tests passed and CR-009 was approved, the promotion from Testing to Production is PASSED. The release is tagged 'v1.0.0' (Baseline BL-05), and an immutable SHA-256 cryptographic release manifest is generated.</w:t>
+        <w:t>The verified branch (feature/multi-developer-collab) is merged into 'develop' and 'main'. The CCB evaluates the SCM Promotion Gate (promote.py). Because automated tests passed and CR-014 was approved, promotion from Development -&gt; Testing -&gt; Production is PASSED. The release is tagged 'v1.0.0' (Baseline BL-05), and an immutable SHA-256 cryptographic release manifest is generated.</w:t>
       </w:r>
     </w:p>
     <w:p>

</xml_diff>